<commit_message>
Updated Meta Coding question solutions and doc
</commit_message>
<xml_diff>
--- a/src/main/resources/meta/Meta_Virtual_Onsite_Questions.docx
+++ b/src/main/resources/meta/Meta_Virtual_Onsite_Questions.docx
@@ -1,438 +1,38 @@
 
 <file path=word/document.xml><?xml version="1.0" encoding="utf-8"?>
-<w:document xmlns:wpc="http://schemas.microsoft.com/office/word/2010/wordprocessingCanvas" xmlns:cx="http://schemas.microsoft.com/office/drawing/2014/chartex" xmlns:cx1="http://schemas.microsoft.com/office/drawing/2015/9/8/chartex" xmlns:cx2="http://schemas.microsoft.com/office/drawing/2015/10/21/chartex" xmlns:cx3="http://schemas.microsoft.com/office/drawing/2016/5/9/chartex" xmlns:cx4="http://schemas.microsoft.com/office/drawing/2016/5/10/chartex" xmlns:cx5="http://schemas.microsoft.com/office/drawing/2016/5/11/chartex" xmlns:cx6="http://schemas.microsoft.com/office/drawing/2016/5/12/chartex" xmlns:cx7="http://schemas.microsoft.com/office/drawing/2016/5/13/chartex" xmlns:cx8="http://schemas.microsoft.com/office/drawing/2016/5/14/chartex" xmlns:mc="http://schemas.openxmlformats.org/markup-compatibility/2006" xmlns:aink="http://schemas.microsoft.com/office/drawing/2016/ink" xmlns:am3d="http://schemas.microsoft.com/office/drawing/2017/model3d" xmlns:o="urn:schemas-microsoft-com:office:office" xmlns:oel="http://schemas.microsoft.com/office/2019/extlst" xmlns:r="http://schemas.openxmlformats.org/officeDocument/2006/relationships" xmlns:m="http://schemas.openxmlformats.org/officeDocument/2006/math" xmlns:v="urn:schemas-microsoft-com:vml" xmlns:wp14="http://schemas.microsoft.com/office/word/2010/wordprocessingDrawing" xmlns:wp="http://schemas.openxmlformats.org/drawingml/2006/wordprocessingDrawing" xmlns:w10="urn:schemas-microsoft-com:office:word" xmlns:w="http://schemas.openxmlformats.org/wordprocessingml/2006/main" xmlns:w14="http://schemas.microsoft.com/office/word/2010/wordml" xmlns:w15="http://schemas.microsoft.com/office/word/2012/wordml" xmlns:w16cex="http://schemas.microsoft.com/office/word/2018/wordml/cex" xmlns:w16cid="http://schemas.microsoft.com/office/word/2016/wordml/cid" xmlns:w16="http://schemas.microsoft.com/office/word/2018/wordml" xmlns:w16sdtdh="http://schemas.microsoft.com/office/word/2020/wordml/sdtdatahash" xmlns:w16se="http://schemas.microsoft.com/office/word/2015/wordml/symex" xmlns:wpg="http://schemas.microsoft.com/office/word/2010/wordprocessingGroup" xmlns:wpi="http://schemas.microsoft.com/office/word/2010/wordprocessingInk" xmlns:wne="http://schemas.microsoft.com/office/word/2006/wordml" xmlns:wps="http://schemas.microsoft.com/office/word/2010/wordprocessingShape" mc:Ignorable="w14 w15 w16se w16cid w16 w16cex w16sdtdh wp14">
+<w:document xmlns:wpc="http://schemas.microsoft.com/office/word/2010/wordprocessingCanvas" xmlns:cx="http://schemas.microsoft.com/office/drawing/2014/chartex" xmlns:cx1="http://schemas.microsoft.com/office/drawing/2015/9/8/chartex" xmlns:cx2="http://schemas.microsoft.com/office/drawing/2015/10/21/chartex" xmlns:cx3="http://schemas.microsoft.com/office/drawing/2016/5/9/chartex" xmlns:cx4="http://schemas.microsoft.com/office/drawing/2016/5/10/chartex" xmlns:cx5="http://schemas.microsoft.com/office/drawing/2016/5/11/chartex" xmlns:cx6="http://schemas.microsoft.com/office/drawing/2016/5/12/chartex" xmlns:cx7="http://schemas.microsoft.com/office/drawing/2016/5/13/chartex" xmlns:cx8="http://schemas.microsoft.com/office/drawing/2016/5/14/chartex" xmlns:mc="http://schemas.openxmlformats.org/markup-compatibility/2006" xmlns:aink="http://schemas.microsoft.com/office/drawing/2016/ink" xmlns:am3d="http://schemas.microsoft.com/office/drawing/2017/model3d" xmlns:o="urn:schemas-microsoft-com:office:office" xmlns:oel="http://schemas.microsoft.com/office/2019/extlst" xmlns:r="http://schemas.openxmlformats.org/officeDocument/2006/relationships" xmlns:m="http://schemas.openxmlformats.org/officeDocument/2006/math" xmlns:v="urn:schemas-microsoft-com:vml" xmlns:wp14="http://schemas.microsoft.com/office/word/2010/wordprocessingDrawing" xmlns:wp="http://schemas.openxmlformats.org/drawingml/2006/wordprocessingDrawing" xmlns:w10="urn:schemas-microsoft-com:office:word" xmlns:w="http://schemas.openxmlformats.org/wordprocessingml/2006/main" xmlns:w14="http://schemas.microsoft.com/office/word/2010/wordml" xmlns:w15="http://schemas.microsoft.com/office/word/2012/wordml" xmlns:w16cex="http://schemas.microsoft.com/office/word/2018/wordml/cex" xmlns:w16cid="http://schemas.microsoft.com/office/word/2016/wordml/cid" xmlns:w16="http://schemas.microsoft.com/office/word/2018/wordml" xmlns:w16du="http://schemas.microsoft.com/office/word/2023/wordml/word16du" xmlns:w16sdtdh="http://schemas.microsoft.com/office/word/2020/wordml/sdtdatahash" xmlns:w16se="http://schemas.microsoft.com/office/word/2015/wordml/symex" xmlns:wpg="http://schemas.microsoft.com/office/word/2010/wordprocessingGroup" xmlns:wpi="http://schemas.microsoft.com/office/word/2010/wordprocessingInk" xmlns:wne="http://schemas.microsoft.com/office/word/2006/wordml" xmlns:wps="http://schemas.microsoft.com/office/word/2010/wordprocessingShape" mc:Ignorable="w14 w15 w16se w16cid w16 w16cex w16sdtdh w16du wp14">
   <w:body>
     <w:p>
       <w:pPr>
+        <w:pStyle w:val="Title"/>
         <w:jc w:val="center"/>
       </w:pPr>
       <w:r>
-        <w:t>Coding Questions</w:t>
+        <w:t>Meta Software Engineer</w:t>
       </w:r>
     </w:p>
     <w:p>
       <w:pPr>
+        <w:pStyle w:val="Subtitle"/>
         <w:jc w:val="center"/>
       </w:pPr>
-    </w:p>
-    <w:p>
-      <w:pPr>
-        <w:pStyle w:val="ListParagraph"/>
-        <w:numPr>
-          <w:ilvl w:val="0"/>
-          <w:numId w:val="1"/>
-        </w:numPr>
-      </w:pPr>
       <w:r>
-        <w:t>You are given an array of strings (a dictionary). The task is to implement two functions. The first is setup(), which preprocesses the dictionary to your liking. The second isMatch(), that, given a word, returns whether or not the word exists in the dictionary. The word given to isMatch() may contain dots ('.') which match exactly one character, but any character value, as shown in the example below. Words may contain any number of dots in any position.</w:t>
+        <w:t>Coding Interview Guide</w:t>
       </w:r>
     </w:p>
     <w:p/>
     <w:p>
-      <w:pPr>
-        <w:ind w:left="720"/>
-      </w:pPr>
       <w:r>
-        <w:t>setup({"foo", "bar", "baz"});</w:t>
+        <w:t xml:space="preserve">Full Guide on Google Drive along with question descriptions: </w:t>
       </w:r>
-    </w:p>
-    <w:p>
-      <w:pPr>
-        <w:ind w:left="720"/>
-      </w:pPr>
-      <w:r>
-        <w:t>isMatch("foo");  // returns true</w:t>
-      </w:r>
-    </w:p>
-    <w:p>
-      <w:pPr>
-        <w:ind w:left="720"/>
-      </w:pPr>
-      <w:r>
-        <w:t>isMatch("garply");  // returns false</w:t>
-      </w:r>
-    </w:p>
-    <w:p>
-      <w:pPr>
-        <w:ind w:left="720"/>
-      </w:pPr>
-      <w:r>
-        <w:t>isMatch("f.o");  // returns true (it matches foo)</w:t>
-      </w:r>
-    </w:p>
-    <w:p>
-      <w:pPr>
-        <w:ind w:left="720"/>
-      </w:pPr>
-      <w:r>
-        <w:t>isMatch("..");  // returns false (there are no two-letter words)</w:t>
-      </w:r>
-    </w:p>
-    <w:p>
-      <w:pPr>
-        <w:ind w:left="720"/>
-      </w:pPr>
-      <w:r>
-        <w:t>isMatch("...");</w:t>
-      </w:r>
-      <w:r>
-        <w:tab/>
-        <w:t>// returns true (any 3 letter word will suffice)</w:t>
-      </w:r>
-    </w:p>
-    <w:p>
-      <w:pPr>
-        <w:ind w:left="720"/>
-      </w:pPr>
-    </w:p>
-    <w:p>
-      <w:pPr>
-        <w:ind w:left="720"/>
-      </w:pPr>
-      <w:r>
-        <w:t>Answer: Question 1</w:t>
-      </w:r>
-    </w:p>
-    <w:p/>
-    <w:p>
-      <w:pPr>
-        <w:pStyle w:val="ListParagraph"/>
-        <w:numPr>
-          <w:ilvl w:val="0"/>
-          <w:numId w:val="1"/>
-        </w:numPr>
-      </w:pPr>
-      <w:r>
-        <w:t>Write a function that takes an input string and an alphabet, and returns the shortest substring of the input which contains every letter of the alphabet at least once.</w:t>
-      </w:r>
-    </w:p>
-    <w:p>
-      <w:pPr>
-        <w:ind w:left="720"/>
-      </w:pPr>
-    </w:p>
-    <w:p>
-      <w:pPr>
-        <w:ind w:left="720"/>
-      </w:pPr>
-      <w:r>
-        <w:t>Input:  "aaccbc"</w:t>
-      </w:r>
-    </w:p>
-    <w:p>
-      <w:pPr>
-        <w:ind w:left="720"/>
-      </w:pPr>
-      <w:r>
-        <w:t>Alphabet: "abc"</w:t>
-      </w:r>
-    </w:p>
-    <w:p>
-      <w:pPr>
-        <w:ind w:left="720"/>
-      </w:pPr>
-      <w:r>
-        <w:t>Output:  "accb"</w:t>
-      </w:r>
-    </w:p>
-    <w:p>
-      <w:pPr>
-        <w:ind w:left="720"/>
-      </w:pPr>
-    </w:p>
-    <w:p>
-      <w:pPr>
-        <w:ind w:left="720"/>
-      </w:pPr>
-      <w:r>
-        <w:t>Answer: Question 2</w:t>
-      </w:r>
-    </w:p>
-    <w:p/>
-    <w:p>
-      <w:pPr>
-        <w:pStyle w:val="ListParagraph"/>
-        <w:numPr>
-          <w:ilvl w:val="0"/>
-          <w:numId w:val="1"/>
-        </w:numPr>
-      </w:pPr>
-      <w:r>
-        <w:t>You are given a tree of nodes, where each node has a collection of children and has an integer 'id' field. Write a function which takes a node and assigns each node in the tree a unique integer id</w:t>
-      </w:r>
-    </w:p>
-    <w:p/>
-    <w:p>
-      <w:pPr>
-        <w:ind w:left="720"/>
-      </w:pPr>
-      <w:r>
-        <w:t>Answer: Question 3</w:t>
-      </w:r>
-    </w:p>
-    <w:p/>
-    <w:p/>
-    <w:p/>
-    <w:p/>
-    <w:p/>
-    <w:p/>
-    <w:p/>
-    <w:p/>
-    <w:p/>
-    <w:p/>
-    <w:p/>
-    <w:p/>
-    <w:p>
-      <w:pPr>
-        <w:pStyle w:val="ListParagraph"/>
-        <w:numPr>
-          <w:ilvl w:val="0"/>
-          <w:numId w:val="1"/>
-        </w:numPr>
-      </w:pPr>
-      <w:r>
-        <w:lastRenderedPageBreak/>
-        <w:t>Implement the following data structure.</w:t>
-      </w:r>
-    </w:p>
-    <w:p>
-      <w:pPr>
-        <w:pStyle w:val="ListParagraph"/>
-      </w:pPr>
-    </w:p>
-    <w:p>
-      <w:pPr>
-        <w:ind w:left="720"/>
-      </w:pPr>
-      <w:r>
-        <w:rPr>
-          <w:noProof/>
-        </w:rPr>
-        <w:drawing>
-          <wp:inline distT="0" distB="0" distL="0" distR="0" wp14:anchorId="683D98BB" wp14:editId="464CBA99">
-            <wp:extent cx="4699000" cy="2832100"/>
-            <wp:effectExtent l="0" t="0" r="0" b="0"/>
-            <wp:docPr id="567674995" name="Picture 1" descr="A screen shot of a computer program&#10;&#10;Description automatically generated"/>
-            <wp:cNvGraphicFramePr>
-              <a:graphicFrameLocks xmlns:a="http://schemas.openxmlformats.org/drawingml/2006/main" noChangeAspect="1"/>
-            </wp:cNvGraphicFramePr>
-            <a:graphic xmlns:a="http://schemas.openxmlformats.org/drawingml/2006/main">
-              <a:graphicData uri="http://schemas.openxmlformats.org/drawingml/2006/picture">
-                <pic:pic xmlns:pic="http://schemas.openxmlformats.org/drawingml/2006/picture">
-                  <pic:nvPicPr>
-                    <pic:cNvPr id="567674995" name="Picture 1" descr="A screen shot of a computer program&#10;&#10;Description automatically generated"/>
-                    <pic:cNvPicPr/>
-                  </pic:nvPicPr>
-                  <pic:blipFill>
-                    <a:blip r:embed="rId5">
-                      <a:extLst>
-                        <a:ext uri="{28A0092B-C50C-407E-A947-70E740481C1C}">
-                          <a14:useLocalDpi xmlns:a14="http://schemas.microsoft.com/office/drawing/2010/main" val="0"/>
-                        </a:ext>
-                      </a:extLst>
-                    </a:blip>
-                    <a:stretch>
-                      <a:fillRect/>
-                    </a:stretch>
-                  </pic:blipFill>
-                  <pic:spPr>
-                    <a:xfrm>
-                      <a:off x="0" y="0"/>
-                      <a:ext cx="4699000" cy="2832100"/>
-                    </a:xfrm>
-                    <a:prstGeom prst="rect">
-                      <a:avLst/>
-                    </a:prstGeom>
-                  </pic:spPr>
-                </pic:pic>
-              </a:graphicData>
-            </a:graphic>
-          </wp:inline>
-        </w:drawing>
-      </w:r>
-    </w:p>
-    <w:p>
-      <w:pPr>
-        <w:ind w:left="720"/>
-      </w:pPr>
-    </w:p>
-    <w:p>
-      <w:pPr>
-        <w:ind w:left="720"/>
-      </w:pPr>
-      <w:r>
-        <w:t>Answer: Question 4</w:t>
-      </w:r>
-    </w:p>
-    <w:p>
-      <w:pPr>
-        <w:ind w:left="720"/>
-      </w:pPr>
-    </w:p>
-    <w:p>
-      <w:pPr>
-        <w:pStyle w:val="ListParagraph"/>
-        <w:numPr>
-          <w:ilvl w:val="0"/>
-          <w:numId w:val="1"/>
-        </w:numPr>
-      </w:pPr>
-      <w:r>
-        <w:t>G</w:t>
-      </w:r>
-      <w:r>
-        <w:t>iven a sequence of integers and an integer total target, return whether a continuous sequence of integers sums up to the target</w:t>
-      </w:r>
-    </w:p>
-    <w:p/>
-    <w:p>
-      <w:pPr>
-        <w:ind w:left="720"/>
-      </w:pPr>
-      <w:r>
-        <w:t>Ex. Nums = [1,2,3,4,5], target = 10, output = true (subarray [1,2,3,4] sums to 10)</w:t>
-      </w:r>
-    </w:p>
-    <w:p>
-      <w:pPr>
-        <w:ind w:left="720"/>
-      </w:pPr>
-    </w:p>
-    <w:p>
-      <w:pPr>
-        <w:ind w:left="720"/>
-      </w:pPr>
-      <w:r>
-        <w:t>Answer: Question 5</w:t>
-      </w:r>
-    </w:p>
-    <w:p/>
-    <w:p>
-      <w:pPr>
-        <w:pStyle w:val="ListParagraph"/>
-        <w:numPr>
-          <w:ilvl w:val="0"/>
-          <w:numId w:val="1"/>
-        </w:numPr>
-      </w:pPr>
-      <w:r>
-        <w:t>F</w:t>
-      </w:r>
-      <w:r>
-        <w:t>ind the first common ancestor of two nodes in a tree. We'll assume that the tree nodes have a structure like the one described, with pointers to their parent and children.</w:t>
-      </w:r>
-      <w:r>
-        <w:t xml:space="preserve"> </w:t>
-      </w:r>
-    </w:p>
-    <w:p/>
-    <w:p>
-      <w:pPr>
-        <w:ind w:left="720"/>
-      </w:pPr>
-      <w:r>
-        <w:t>Note – this is a generic tree not binary tree</w:t>
-      </w:r>
-    </w:p>
-    <w:p/>
-    <w:p>
-      <w:pPr>
-        <w:pStyle w:val="ListParagraph"/>
-        <w:numPr>
-          <w:ilvl w:val="0"/>
-          <w:numId w:val="1"/>
-        </w:numPr>
-      </w:pPr>
-      <w:r>
-        <w:rPr>
-          <w:rFonts w:ascii="Segoe UI" w:hAnsi="Segoe UI" w:cs="Segoe UI"/>
-          <w:color w:val="0F0F0F"/>
-        </w:rPr>
-        <w:t>Given an input string, write a function that can check to see if the string can be made into palindrome by removing one character</w:t>
-      </w:r>
-    </w:p>
-    <w:p/>
-    <w:p>
-      <w:pPr>
-        <w:ind w:left="720"/>
-      </w:pPr>
-      <w:r>
-        <w:t>Ex. String = “abca”, output = true. Removed ‘c’ to make “aba” which is palindrome</w:t>
-      </w:r>
-    </w:p>
-    <w:p>
-      <w:pPr>
-        <w:ind w:left="720"/>
-      </w:pPr>
-    </w:p>
-    <w:p>
-      <w:pPr>
-        <w:ind w:left="720"/>
-      </w:pPr>
-      <w:r>
-        <w:t>Empty string or null string is true by default.</w:t>
-      </w:r>
-    </w:p>
-    <w:p>
-      <w:pPr>
-        <w:ind w:left="720"/>
-      </w:pPr>
-    </w:p>
-    <w:p>
-      <w:pPr>
-        <w:ind w:left="720"/>
-      </w:pPr>
-      <w:r>
-        <w:t>Answer: Question 7</w:t>
-      </w:r>
-    </w:p>
-    <w:p/>
-    <w:p>
-      <w:pPr>
-        <w:pStyle w:val="ListParagraph"/>
-        <w:numPr>
-          <w:ilvl w:val="0"/>
-          <w:numId w:val="1"/>
-        </w:numPr>
-      </w:pPr>
-      <w:r>
-        <w:t xml:space="preserve">Given the root node of a binary tree, all the values of the nodes are integers. We want to print the values in this tree based on columns. As you go down to left child node, you go </w:t>
-      </w:r>
-      <w:r>
-        <w:lastRenderedPageBreak/>
-        <w:t>towards left column. As you go to the right you increase column. You want to print from top to bottom</w:t>
-      </w:r>
-    </w:p>
-    <w:p>
-      <w:pPr>
-        <w:pStyle w:val="ListParagraph"/>
-      </w:pPr>
-    </w:p>
-    <w:p>
-      <w:pPr>
-        <w:pStyle w:val="ListParagraph"/>
-      </w:pPr>
-      <w:r>
-        <w:t>In other words: Print values in binary tree from left to right and from top to bottom (vertical traversal). We do not care about maintaining order of values in asc or desc, but must be top down.</w:t>
-      </w:r>
-    </w:p>
-    <w:p>
-      <w:pPr>
-        <w:pStyle w:val="ListParagraph"/>
-      </w:pPr>
-    </w:p>
-    <w:p>
-      <w:pPr>
-        <w:pStyle w:val="ListParagraph"/>
-      </w:pPr>
-      <w:r>
-        <w:t>Answer: Question 8</w:t>
-      </w:r>
-    </w:p>
-    <w:p>
-      <w:pPr>
-        <w:ind w:left="720"/>
-      </w:pPr>
+      <w:hyperlink r:id="rId5" w:anchor="heading=h.w7ndrpqey0n7" w:history="1">
+        <w:r>
+          <w:rPr>
+            <w:rStyle w:val="Hyperlink"/>
+          </w:rPr>
+          <w:t>Click Here</w:t>
+        </w:r>
+      </w:hyperlink>
     </w:p>
     <w:sectPr>
       <w:pgSz w:w="12240" w:h="15840"/>
@@ -445,7 +45,7 @@
 </file>
 
 <file path=word/numbering.xml><?xml version="1.0" encoding="utf-8"?>
-<w:numbering xmlns:wpc="http://schemas.microsoft.com/office/word/2010/wordprocessingCanvas" xmlns:cx="http://schemas.microsoft.com/office/drawing/2014/chartex" xmlns:cx1="http://schemas.microsoft.com/office/drawing/2015/9/8/chartex" xmlns:cx2="http://schemas.microsoft.com/office/drawing/2015/10/21/chartex" xmlns:cx3="http://schemas.microsoft.com/office/drawing/2016/5/9/chartex" xmlns:cx4="http://schemas.microsoft.com/office/drawing/2016/5/10/chartex" xmlns:cx5="http://schemas.microsoft.com/office/drawing/2016/5/11/chartex" xmlns:cx6="http://schemas.microsoft.com/office/drawing/2016/5/12/chartex" xmlns:cx7="http://schemas.microsoft.com/office/drawing/2016/5/13/chartex" xmlns:cx8="http://schemas.microsoft.com/office/drawing/2016/5/14/chartex" xmlns:mc="http://schemas.openxmlformats.org/markup-compatibility/2006" xmlns:aink="http://schemas.microsoft.com/office/drawing/2016/ink" xmlns:am3d="http://schemas.microsoft.com/office/drawing/2017/model3d" xmlns:o="urn:schemas-microsoft-com:office:office" xmlns:oel="http://schemas.microsoft.com/office/2019/extlst" xmlns:r="http://schemas.openxmlformats.org/officeDocument/2006/relationships" xmlns:m="http://schemas.openxmlformats.org/officeDocument/2006/math" xmlns:v="urn:schemas-microsoft-com:vml" xmlns:wp14="http://schemas.microsoft.com/office/word/2010/wordprocessingDrawing" xmlns:wp="http://schemas.openxmlformats.org/drawingml/2006/wordprocessingDrawing" xmlns:w10="urn:schemas-microsoft-com:office:word" xmlns:w="http://schemas.openxmlformats.org/wordprocessingml/2006/main" xmlns:w14="http://schemas.microsoft.com/office/word/2010/wordml" xmlns:w15="http://schemas.microsoft.com/office/word/2012/wordml" xmlns:w16cex="http://schemas.microsoft.com/office/word/2018/wordml/cex" xmlns:w16cid="http://schemas.microsoft.com/office/word/2016/wordml/cid" xmlns:w16="http://schemas.microsoft.com/office/word/2018/wordml" xmlns:w16sdtdh="http://schemas.microsoft.com/office/word/2020/wordml/sdtdatahash" xmlns:w16se="http://schemas.microsoft.com/office/word/2015/wordml/symex" xmlns:wpg="http://schemas.microsoft.com/office/word/2010/wordprocessingGroup" xmlns:wpi="http://schemas.microsoft.com/office/word/2010/wordprocessingInk" xmlns:wne="http://schemas.microsoft.com/office/word/2006/wordml" xmlns:wps="http://schemas.microsoft.com/office/word/2010/wordprocessingShape" mc:Ignorable="w14 w15 w16se w16cid w16 w16cex w16sdtdh wp14">
+<w:numbering xmlns:wpc="http://schemas.microsoft.com/office/word/2010/wordprocessingCanvas" xmlns:cx="http://schemas.microsoft.com/office/drawing/2014/chartex" xmlns:cx1="http://schemas.microsoft.com/office/drawing/2015/9/8/chartex" xmlns:cx2="http://schemas.microsoft.com/office/drawing/2015/10/21/chartex" xmlns:cx3="http://schemas.microsoft.com/office/drawing/2016/5/9/chartex" xmlns:cx4="http://schemas.microsoft.com/office/drawing/2016/5/10/chartex" xmlns:cx5="http://schemas.microsoft.com/office/drawing/2016/5/11/chartex" xmlns:cx6="http://schemas.microsoft.com/office/drawing/2016/5/12/chartex" xmlns:cx7="http://schemas.microsoft.com/office/drawing/2016/5/13/chartex" xmlns:cx8="http://schemas.microsoft.com/office/drawing/2016/5/14/chartex" xmlns:mc="http://schemas.openxmlformats.org/markup-compatibility/2006" xmlns:aink="http://schemas.microsoft.com/office/drawing/2016/ink" xmlns:am3d="http://schemas.microsoft.com/office/drawing/2017/model3d" xmlns:o="urn:schemas-microsoft-com:office:office" xmlns:oel="http://schemas.microsoft.com/office/2019/extlst" xmlns:r="http://schemas.openxmlformats.org/officeDocument/2006/relationships" xmlns:m="http://schemas.openxmlformats.org/officeDocument/2006/math" xmlns:v="urn:schemas-microsoft-com:vml" xmlns:wp14="http://schemas.microsoft.com/office/word/2010/wordprocessingDrawing" xmlns:wp="http://schemas.openxmlformats.org/drawingml/2006/wordprocessingDrawing" xmlns:w10="urn:schemas-microsoft-com:office:word" xmlns:w="http://schemas.openxmlformats.org/wordprocessingml/2006/main" xmlns:w14="http://schemas.microsoft.com/office/word/2010/wordml" xmlns:w15="http://schemas.microsoft.com/office/word/2012/wordml" xmlns:w16cex="http://schemas.microsoft.com/office/word/2018/wordml/cex" xmlns:w16cid="http://schemas.microsoft.com/office/word/2016/wordml/cid" xmlns:w16="http://schemas.microsoft.com/office/word/2018/wordml" xmlns:w16du="http://schemas.microsoft.com/office/word/2023/wordml/word16du" xmlns:w16sdtdh="http://schemas.microsoft.com/office/word/2020/wordml/sdtdatahash" xmlns:w16se="http://schemas.microsoft.com/office/word/2015/wordml/symex" xmlns:wpg="http://schemas.microsoft.com/office/word/2010/wordprocessingGroup" xmlns:wpi="http://schemas.microsoft.com/office/word/2010/wordprocessingInk" xmlns:wne="http://schemas.microsoft.com/office/word/2006/wordml" xmlns:wps="http://schemas.microsoft.com/office/word/2010/wordprocessingShape" mc:Ignorable="w14 w15 w16se w16cid w16 w16cex w16sdtdh w16du wp14">
   <w:abstractNum w:abstractNumId="0" w15:restartNumberingAfterBreak="0">
     <w:nsid w:val="357E503A"/>
     <w:multiLevelType w:val="hybridMultilevel"/>
@@ -542,7 +142,7 @@
 </file>
 
 <file path=word/styles.xml><?xml version="1.0" encoding="utf-8"?>
-<w:styles xmlns:mc="http://schemas.openxmlformats.org/markup-compatibility/2006" xmlns:r="http://schemas.openxmlformats.org/officeDocument/2006/relationships" xmlns:w="http://schemas.openxmlformats.org/wordprocessingml/2006/main" xmlns:w14="http://schemas.microsoft.com/office/word/2010/wordml" xmlns:w15="http://schemas.microsoft.com/office/word/2012/wordml" xmlns:w16cex="http://schemas.microsoft.com/office/word/2018/wordml/cex" xmlns:w16cid="http://schemas.microsoft.com/office/word/2016/wordml/cid" xmlns:w16="http://schemas.microsoft.com/office/word/2018/wordml" xmlns:w16sdtdh="http://schemas.microsoft.com/office/word/2020/wordml/sdtdatahash" xmlns:w16se="http://schemas.microsoft.com/office/word/2015/wordml/symex" mc:Ignorable="w14 w15 w16se w16cid w16 w16cex w16sdtdh">
+<w:styles xmlns:mc="http://schemas.openxmlformats.org/markup-compatibility/2006" xmlns:r="http://schemas.openxmlformats.org/officeDocument/2006/relationships" xmlns:w="http://schemas.openxmlformats.org/wordprocessingml/2006/main" xmlns:w14="http://schemas.microsoft.com/office/word/2010/wordml" xmlns:w15="http://schemas.microsoft.com/office/word/2012/wordml" xmlns:w16cex="http://schemas.microsoft.com/office/word/2018/wordml/cex" xmlns:w16cid="http://schemas.microsoft.com/office/word/2016/wordml/cid" xmlns:w16="http://schemas.microsoft.com/office/word/2018/wordml" xmlns:w16du="http://schemas.microsoft.com/office/word/2023/wordml/word16du" xmlns:w16sdtdh="http://schemas.microsoft.com/office/word/2020/wordml/sdtdatahash" xmlns:w16se="http://schemas.microsoft.com/office/word/2015/wordml/symex" mc:Ignorable="w14 w15 w16se w16cid w16 w16cex w16sdtdh w16du">
   <w:docDefaults>
     <w:rPrDefault>
       <w:rPr>
@@ -941,6 +541,7 @@
   <w:style w:type="character" w:default="1" w:styleId="DefaultParagraphFont">
     <w:name w:val="Default Paragraph Font"/>
     <w:uiPriority w:val="1"/>
+    <w:semiHidden/>
     <w:unhideWhenUsed/>
   </w:style>
   <w:style w:type="table" w:default="1" w:styleId="TableNormal">
@@ -974,6 +575,98 @@
       <w:ind w:left="720"/>
       <w:contextualSpacing/>
     </w:pPr>
+  </w:style>
+  <w:style w:type="paragraph" w:styleId="Title">
+    <w:name w:val="Title"/>
+    <w:basedOn w:val="Normal"/>
+    <w:next w:val="Normal"/>
+    <w:link w:val="TitleChar"/>
+    <w:uiPriority w:val="10"/>
+    <w:qFormat/>
+    <w:rsid w:val="00C84715"/>
+    <w:pPr>
+      <w:contextualSpacing/>
+    </w:pPr>
+    <w:rPr>
+      <w:rFonts w:asciiTheme="majorHAnsi" w:eastAsiaTheme="majorEastAsia" w:hAnsiTheme="majorHAnsi" w:cstheme="majorBidi"/>
+      <w:spacing w:val="-10"/>
+      <w:kern w:val="28"/>
+      <w:sz w:val="56"/>
+      <w:szCs w:val="56"/>
+    </w:rPr>
+  </w:style>
+  <w:style w:type="character" w:customStyle="1" w:styleId="TitleChar">
+    <w:name w:val="Title Char"/>
+    <w:basedOn w:val="DefaultParagraphFont"/>
+    <w:link w:val="Title"/>
+    <w:uiPriority w:val="10"/>
+    <w:rsid w:val="00C84715"/>
+    <w:rPr>
+      <w:rFonts w:asciiTheme="majorHAnsi" w:eastAsiaTheme="majorEastAsia" w:hAnsiTheme="majorHAnsi" w:cstheme="majorBidi"/>
+      <w:spacing w:val="-10"/>
+      <w:kern w:val="28"/>
+      <w:sz w:val="56"/>
+      <w:szCs w:val="56"/>
+    </w:rPr>
+  </w:style>
+  <w:style w:type="paragraph" w:styleId="Subtitle">
+    <w:name w:val="Subtitle"/>
+    <w:basedOn w:val="Normal"/>
+    <w:next w:val="Normal"/>
+    <w:link w:val="SubtitleChar"/>
+    <w:uiPriority w:val="11"/>
+    <w:qFormat/>
+    <w:rsid w:val="00C84715"/>
+    <w:pPr>
+      <w:numPr>
+        <w:ilvl w:val="1"/>
+      </w:numPr>
+      <w:spacing w:after="160"/>
+    </w:pPr>
+    <w:rPr>
+      <w:rFonts w:eastAsiaTheme="minorEastAsia"/>
+      <w:color w:val="5A5A5A" w:themeColor="text1" w:themeTint="A5"/>
+      <w:spacing w:val="15"/>
+      <w:sz w:val="22"/>
+      <w:szCs w:val="22"/>
+    </w:rPr>
+  </w:style>
+  <w:style w:type="character" w:customStyle="1" w:styleId="SubtitleChar">
+    <w:name w:val="Subtitle Char"/>
+    <w:basedOn w:val="DefaultParagraphFont"/>
+    <w:link w:val="Subtitle"/>
+    <w:uiPriority w:val="11"/>
+    <w:rsid w:val="00C84715"/>
+    <w:rPr>
+      <w:rFonts w:eastAsiaTheme="minorEastAsia"/>
+      <w:color w:val="5A5A5A" w:themeColor="text1" w:themeTint="A5"/>
+      <w:spacing w:val="15"/>
+      <w:sz w:val="22"/>
+      <w:szCs w:val="22"/>
+    </w:rPr>
+  </w:style>
+  <w:style w:type="character" w:styleId="Hyperlink">
+    <w:name w:val="Hyperlink"/>
+    <w:basedOn w:val="DefaultParagraphFont"/>
+    <w:uiPriority w:val="99"/>
+    <w:unhideWhenUsed/>
+    <w:rsid w:val="00C84715"/>
+    <w:rPr>
+      <w:color w:val="0563C1" w:themeColor="hyperlink"/>
+      <w:u w:val="single"/>
+    </w:rPr>
+  </w:style>
+  <w:style w:type="character" w:styleId="UnresolvedMention">
+    <w:name w:val="Unresolved Mention"/>
+    <w:basedOn w:val="DefaultParagraphFont"/>
+    <w:uiPriority w:val="99"/>
+    <w:semiHidden/>
+    <w:unhideWhenUsed/>
+    <w:rsid w:val="00C84715"/>
+    <w:rPr>
+      <w:color w:val="605E5C"/>
+      <w:shd w:val="clear" w:color="auto" w:fill="E1DFDD"/>
+    </w:rPr>
   </w:style>
 </w:styles>
 </file>

</xml_diff>